<commit_message>
TableA1_7models: fill LLaVA-v1.6-Mistral-7B column (complete 7-model sweep); final_check_report: 12th-draft verification + supervisor-readiness verdict
</commit_message>
<xml_diff>
--- a/TableA1_7models.docx
+++ b/TableA1_7models.docx
@@ -8,7 +8,7 @@
           <w:b/>
           <w:sz w:val="28"/>
         </w:rPr>
-        <w:t>Appendix A — Table A1 with all seven models (for 11th_draft.docx)</w:t>
+        <w:t>Appendix A — Table A1 with all seven models (for 12th_draft.docx)</w:t>
       </w:r>
     </w:p>
     <w:p>
@@ -17,7 +17,7 @@
           <w:i/>
           <w:color w:val="6B7280"/>
         </w:rPr>
-        <w:t>Paste this table over the current six-model Table A1 in Appendix A (select the old table, paste, keep the caption line above it — use the updated caption from report_v2.docx, N1-c). Delete this instruction line after pasting.</w:t>
+        <w:t>Paste this table over the current six-model Table A1 in Appendix A of the 12th draft (select the old table, paste, keep the caption line above it — the caption in your draft is already correct). The header now uses the lowercase τ, which also retires the old capital-T header quirk. Delete this instruction line after pasting.</w:t>
       </w:r>
     </w:p>
     <w:p>
@@ -294,7 +294,15 @@
           <w:tcPr>
             <w:tcW w:type="dxa" w:w="1080"/>
           </w:tcPr>
-          <w:p/>
+          <w:p>
+            <w:r/>
+            <w:r>
+              <w:rPr>
+                <w:sz w:val="20"/>
+              </w:rPr>
+              <w:t>77.41</w:t>
+            </w:r>
+          </w:p>
         </w:tc>
       </w:tr>
       <w:tr>
@@ -403,7 +411,15 @@
           <w:tcPr>
             <w:tcW w:type="dxa" w:w="1080"/>
           </w:tcPr>
-          <w:p/>
+          <w:p>
+            <w:r/>
+            <w:r>
+              <w:rPr>
+                <w:sz w:val="20"/>
+              </w:rPr>
+              <w:t>77.51</w:t>
+            </w:r>
+          </w:p>
         </w:tc>
       </w:tr>
       <w:tr>
@@ -512,7 +528,15 @@
           <w:tcPr>
             <w:tcW w:type="dxa" w:w="1080"/>
           </w:tcPr>
-          <w:p/>
+          <w:p>
+            <w:r/>
+            <w:r>
+              <w:rPr>
+                <w:sz w:val="20"/>
+              </w:rPr>
+              <w:t>77.72</w:t>
+            </w:r>
+          </w:p>
         </w:tc>
       </w:tr>
       <w:tr>
@@ -621,7 +645,15 @@
           <w:tcPr>
             <w:tcW w:type="dxa" w:w="1080"/>
           </w:tcPr>
-          <w:p/>
+          <w:p>
+            <w:r/>
+            <w:r>
+              <w:rPr>
+                <w:sz w:val="20"/>
+              </w:rPr>
+              <w:t>77.97</w:t>
+            </w:r>
+          </w:p>
         </w:tc>
       </w:tr>
       <w:tr>
@@ -730,7 +762,15 @@
           <w:tcPr>
             <w:tcW w:type="dxa" w:w="1080"/>
           </w:tcPr>
-          <w:p/>
+          <w:p>
+            <w:r/>
+            <w:r>
+              <w:rPr>
+                <w:sz w:val="20"/>
+              </w:rPr>
+              <w:t>78.37</w:t>
+            </w:r>
+          </w:p>
         </w:tc>
       </w:tr>
       <w:tr>
@@ -839,7 +879,15 @@
           <w:tcPr>
             <w:tcW w:type="dxa" w:w="1080"/>
           </w:tcPr>
-          <w:p/>
+          <w:p>
+            <w:r/>
+            <w:r>
+              <w:rPr>
+                <w:sz w:val="20"/>
+              </w:rPr>
+              <w:t>78.52</w:t>
+            </w:r>
+          </w:p>
         </w:tc>
       </w:tr>
       <w:tr>
@@ -948,7 +996,15 @@
           <w:tcPr>
             <w:tcW w:type="dxa" w:w="1080"/>
           </w:tcPr>
-          <w:p/>
+          <w:p>
+            <w:r/>
+            <w:r>
+              <w:rPr>
+                <w:sz w:val="20"/>
+              </w:rPr>
+              <w:t>78.87</w:t>
+            </w:r>
+          </w:p>
         </w:tc>
       </w:tr>
       <w:tr>
@@ -986,11 +1042,13 @@
         <w:tc>
           <w:tcPr>
             <w:tcW w:type="dxa" w:w="1080"/>
+            <w:shd w:val="clear" w:fill="EAF6F3"/>
           </w:tcPr>
           <w:p>
             <w:r/>
             <w:r>
               <w:rPr>
+                <w:b/>
                 <w:sz w:val="20"/>
               </w:rPr>
               <w:t>77.08</w:t>
@@ -1057,7 +1115,15 @@
           <w:tcPr>
             <w:tcW w:type="dxa" w:w="1080"/>
           </w:tcPr>
-          <w:p/>
+          <w:p>
+            <w:r/>
+            <w:r>
+              <w:rPr>
+                <w:sz w:val="20"/>
+              </w:rPr>
+              <w:t>79.37</w:t>
+            </w:r>
+          </w:p>
         </w:tc>
       </w:tr>
       <w:tr>
@@ -1166,7 +1232,15 @@
           <w:tcPr>
             <w:tcW w:type="dxa" w:w="1080"/>
           </w:tcPr>
-          <w:p/>
+          <w:p>
+            <w:r/>
+            <w:r>
+              <w:rPr>
+                <w:sz w:val="20"/>
+              </w:rPr>
+              <w:t>79.96</w:t>
+            </w:r>
+          </w:p>
         </w:tc>
       </w:tr>
       <w:tr>
@@ -1275,7 +1349,15 @@
           <w:tcPr>
             <w:tcW w:type="dxa" w:w="1080"/>
           </w:tcPr>
-          <w:p/>
+          <w:p>
+            <w:r/>
+            <w:r>
+              <w:rPr>
+                <w:sz w:val="20"/>
+              </w:rPr>
+              <w:t>80.38</w:t>
+            </w:r>
+          </w:p>
         </w:tc>
       </w:tr>
       <w:tr>
@@ -1341,11 +1423,13 @@
         <w:tc>
           <w:tcPr>
             <w:tcW w:type="dxa" w:w="1080"/>
+            <w:shd w:val="clear" w:fill="EAF6F3"/>
           </w:tcPr>
           <w:p>
             <w:r/>
             <w:r>
               <w:rPr>
+                <w:b/>
                 <w:sz w:val="20"/>
               </w:rPr>
               <w:t>80.92</w:t>
@@ -1384,7 +1468,15 @@
           <w:tcPr>
             <w:tcW w:type="dxa" w:w="1080"/>
           </w:tcPr>
-          <w:p/>
+          <w:p>
+            <w:r/>
+            <w:r>
+              <w:rPr>
+                <w:sz w:val="20"/>
+              </w:rPr>
+              <w:t>81.00</w:t>
+            </w:r>
+          </w:p>
         </w:tc>
       </w:tr>
       <w:tr>
@@ -1493,7 +1585,15 @@
           <w:tcPr>
             <w:tcW w:type="dxa" w:w="1080"/>
           </w:tcPr>
-          <w:p/>
+          <w:p>
+            <w:r/>
+            <w:r>
+              <w:rPr>
+                <w:sz w:val="20"/>
+              </w:rPr>
+              <w:t>81.48</w:t>
+            </w:r>
+          </w:p>
         </w:tc>
       </w:tr>
       <w:tr>
@@ -1602,7 +1702,15 @@
           <w:tcPr>
             <w:tcW w:type="dxa" w:w="1080"/>
           </w:tcPr>
-          <w:p/>
+          <w:p>
+            <w:r/>
+            <w:r>
+              <w:rPr>
+                <w:sz w:val="20"/>
+              </w:rPr>
+              <w:t>82.15</w:t>
+            </w:r>
+          </w:p>
         </w:tc>
       </w:tr>
       <w:tr>
@@ -1654,11 +1762,13 @@
         <w:tc>
           <w:tcPr>
             <w:tcW w:type="dxa" w:w="1080"/>
+            <w:shd w:val="clear" w:fill="EAF6F3"/>
           </w:tcPr>
           <w:p>
             <w:r/>
             <w:r>
               <w:rPr>
+                <w:b/>
                 <w:sz w:val="20"/>
               </w:rPr>
               <w:t>67.02</w:t>
@@ -1711,7 +1821,15 @@
           <w:tcPr>
             <w:tcW w:type="dxa" w:w="1080"/>
           </w:tcPr>
-          <w:p/>
+          <w:p>
+            <w:r/>
+            <w:r>
+              <w:rPr>
+                <w:sz w:val="20"/>
+              </w:rPr>
+              <w:t>83.03</w:t>
+            </w:r>
+          </w:p>
         </w:tc>
       </w:tr>
       <w:tr>
@@ -1791,11 +1909,13 @@
         <w:tc>
           <w:tcPr>
             <w:tcW w:type="dxa" w:w="1080"/>
+            <w:shd w:val="clear" w:fill="EAF6F3"/>
           </w:tcPr>
           <w:p>
             <w:r/>
             <w:r>
               <w:rPr>
+                <w:b/>
                 <w:sz w:val="20"/>
               </w:rPr>
               <w:t>81.75</w:t>
@@ -1820,7 +1940,15 @@
           <w:tcPr>
             <w:tcW w:type="dxa" w:w="1080"/>
           </w:tcPr>
-          <w:p/>
+          <w:p>
+            <w:r/>
+            <w:r>
+              <w:rPr>
+                <w:sz w:val="20"/>
+              </w:rPr>
+              <w:t>83.68</w:t>
+            </w:r>
+          </w:p>
         </w:tc>
       </w:tr>
       <w:tr>
@@ -1844,11 +1972,13 @@
         <w:tc>
           <w:tcPr>
             <w:tcW w:type="dxa" w:w="1080"/>
+            <w:shd w:val="clear" w:fill="EAF6F3"/>
           </w:tcPr>
           <w:p>
             <w:r/>
             <w:r>
               <w:rPr>
+                <w:b/>
                 <w:sz w:val="20"/>
               </w:rPr>
               <w:t>78.00</w:t>
@@ -1914,11 +2044,13 @@
         <w:tc>
           <w:tcPr>
             <w:tcW w:type="dxa" w:w="1080"/>
+            <w:shd w:val="clear" w:fill="EAF6F3"/>
           </w:tcPr>
           <w:p>
             <w:r/>
             <w:r>
               <w:rPr>
+                <w:b/>
                 <w:sz w:val="20"/>
               </w:rPr>
               <w:t>75.56</w:t>
@@ -1929,7 +2061,15 @@
           <w:tcPr>
             <w:tcW w:type="dxa" w:w="1080"/>
           </w:tcPr>
-          <w:p/>
+          <w:p>
+            <w:r/>
+            <w:r>
+              <w:rPr>
+                <w:sz w:val="20"/>
+              </w:rPr>
+              <w:t>86.01</w:t>
+            </w:r>
+          </w:p>
         </w:tc>
       </w:tr>
       <w:tr>
@@ -2037,8 +2177,18 @@
         <w:tc>
           <w:tcPr>
             <w:tcW w:type="dxa" w:w="1080"/>
+            <w:shd w:val="clear" w:fill="EAF6F3"/>
           </w:tcPr>
-          <w:p/>
+          <w:p>
+            <w:r/>
+            <w:r>
+              <w:rPr>
+                <w:b/>
+                <w:sz w:val="20"/>
+              </w:rPr>
+              <w:t>86.06</w:t>
+            </w:r>
+          </w:p>
         </w:tc>
       </w:tr>
       <w:tr>
@@ -2147,7 +2297,15 @@
           <w:tcPr>
             <w:tcW w:type="dxa" w:w="1080"/>
           </w:tcPr>
-          <w:p/>
+          <w:p>
+            <w:r/>
+            <w:r>
+              <w:rPr>
+                <w:sz w:val="20"/>
+              </w:rPr>
+              <w:t>86.06</w:t>
+            </w:r>
+          </w:p>
         </w:tc>
       </w:tr>
       <w:tr>
@@ -2256,7 +2414,15 @@
           <w:tcPr>
             <w:tcW w:type="dxa" w:w="1080"/>
           </w:tcPr>
-          <w:p/>
+          <w:p>
+            <w:r/>
+            <w:r>
+              <w:rPr>
+                <w:sz w:val="20"/>
+              </w:rPr>
+              <w:t>86.06</w:t>
+            </w:r>
+          </w:p>
         </w:tc>
       </w:tr>
       <w:tr>
@@ -2365,7 +2531,15 @@
           <w:tcPr>
             <w:tcW w:type="dxa" w:w="1080"/>
           </w:tcPr>
-          <w:p/>
+          <w:p>
+            <w:r/>
+            <w:r>
+              <w:rPr>
+                <w:sz w:val="20"/>
+              </w:rPr>
+              <w:t>86.06</w:t>
+            </w:r>
+          </w:p>
         </w:tc>
       </w:tr>
       <w:tr>
@@ -2474,7 +2648,15 @@
           <w:tcPr>
             <w:tcW w:type="dxa" w:w="1080"/>
           </w:tcPr>
-          <w:p/>
+          <w:p>
+            <w:r/>
+            <w:r>
+              <w:rPr>
+                <w:sz w:val="20"/>
+              </w:rPr>
+              <w:t>86.06</w:t>
+            </w:r>
+          </w:p>
         </w:tc>
       </w:tr>
     </w:tbl>

</xml_diff>